<commit_message>
updated megan's project. add moderations, add tables
</commit_message>
<xml_diff>
--- a/Danny/Danny-Abstract-Psychonom.docx
+++ b/Danny/Danny-Abstract-Psychonom.docx
@@ -19,6 +19,9 @@
       </w:r>
       <w:r>
         <w:t xml:space="preserve"> </w:t>
+      </w:r>
+      <w:r>
+        <w:t>Task and Strategic Determinants of the Irrelevant Sound Effect</w:t>
       </w:r>
     </w:p>
     <w:p>
@@ -76,10 +79,7 @@
         <w:t>43) = 2.48, p = .017, d = .37).</w:t>
       </w:r>
       <w:r>
-        <w:t xml:space="preserve"> </w:t>
-      </w:r>
-      <w:r>
-        <w:t xml:space="preserve">In free recall (Exp 1), </w:t>
+        <w:t xml:space="preserve"> In free recall (Exp 1), </w:t>
       </w:r>
       <w:proofErr w:type="gramStart"/>
       <w:r>
@@ -151,13 +151,7 @@
       </w:r>
       <w:proofErr w:type="gramEnd"/>
       <w:r>
-        <w:t xml:space="preserve">29) = 3.5, p = .001, d = .65). </w:t>
-      </w:r>
-      <w:r>
-        <w:t>Additionally, r</w:t>
-      </w:r>
-      <w:r>
-        <w:t xml:space="preserve">ehearsal did not amplify disruption (Exp 2 strategy × sound interaction: </w:t>
+        <w:t xml:space="preserve">29) = 3.5, p = .001, d = .65). Additionally, rehearsal did not amplify disruption (Exp 2 strategy × sound interaction: </w:t>
       </w:r>
       <w:proofErr w:type="gramStart"/>
       <w:r>
@@ -165,30 +159,7 @@
       </w:r>
       <w:proofErr w:type="gramEnd"/>
       <w:r>
-        <w:t>2,260) = 2.85, p = .75).</w:t>
-      </w:r>
-      <w:r>
-        <w:t xml:space="preserve"> </w:t>
-      </w:r>
-      <w:r>
-        <w:t xml:space="preserve">These findings challenge rehearsal-disruption accounts </w:t>
-      </w:r>
-      <w:r>
-        <w:t xml:space="preserve">of ISE </w:t>
-      </w:r>
-      <w:proofErr w:type="spellStart"/>
-      <w:r>
-        <w:t>and</w:t>
-      </w:r>
-      <w:proofErr w:type="spellEnd"/>
-      <w:r>
-        <w:t xml:space="preserve"> instead suggest that ISE </w:t>
-      </w:r>
-      <w:r>
-        <w:t>may</w:t>
-      </w:r>
-      <w:r>
-        <w:t xml:space="preserve"> stem from broader task–strategy–sound interactions.</w:t>
+        <w:t>2,260) = 2.85, p = .75). These findings challenge rehearsal-disruption accounts of ISE and instead suggest that ISE may stem from broader task–strategy–sound interactions.</w:t>
       </w:r>
     </w:p>
     <w:p>

</xml_diff>